<commit_message>
Plan Mode Summary: add third rebuild addendum (17 Oct 2026)
</commit_message>
<xml_diff>
--- a/docs/architecture/Agentic Security Platform Plan Mode Summary.docx
+++ b/docs/architecture/Agentic Security Platform Plan Mode Summary.docx
@@ -79,7 +79,7 @@
           <w:b w:val="0"/>
           <w:sz w:val="22"/>
         </w:rPr>
-        <w:t xml:space="preserve">Updated 16 October 2026. Scripts </w:t>
+        <w:t xml:space="preserve">Updated 17 October 2026. Scripts </w:t>
       </w:r>
       <w:r>
         <w:rPr>
@@ -300,7 +300,7 @@
                 <w:b w:val="0"/>
                 <w:sz w:val="18"/>
               </w:rPr>
-              <w:t xml:space="preserve">Verified end to end on 16 October 2026, then torn down; remediation remains disabled</w:t>
+              <w:t xml:space="preserve">Verified end to end on 16–17 October 2026, then torn down; remediation remains disabled</w:t>
             </w:r>
             <w:r>
               <w:rPr>
@@ -18536,6 +18536,739 @@
         <w:t xml:space="preserve">Across the two runs every planned step has now been exercised live except the release workflow's in-cloud deploy job, which cannot reach the GKE control plane from GitHub-hosted runners.</w:t>
       </w:r>
     </w:p>
+    <w:p>
+      <w:pPr>
+        <w:pageBreakBefore/>
+        <w:spacing w:before="120" w:after="120"/>
+        <w:pBdr>
+          <w:bottom w:val="single" w:sz="12" w:space="1" w:color="0F766E"/>
+        </w:pBdr>
+      </w:pPr>
+    </w:p>
+    <w:p>
+      <w:pPr>
+        <w:spacing w:before="320" w:after="160"/>
+      </w:pPr>
+      <w:r>
+        <w:rPr>
+          <w:rFonts w:ascii="Calibri" w:hAnsi="Calibri" w:eastAsia="Calibri"/>
+          <w:b/>
+          <w:color w:val="1B365D"/>
+          <w:sz w:val="32"/>
+        </w:rPr>
+        <w:t xml:space="preserve">Addendum: Third rebuild and hardening (17 October 2026)</w:t>
+      </w:r>
+    </w:p>
+    <w:p>
+      <w:pPr>
+        <w:spacing w:after="160" w:line="240" w:lineRule="auto"/>
+      </w:pPr>
+      <w:r>
+        <w:rPr>
+          <w:rFonts w:ascii="Calibri" w:hAnsi="Calibri" w:eastAsia="Calibri"/>
+          <w:b w:val="0"/>
+          <w:sz w:val="22"/>
+        </w:rPr>
+        <w:t xml:space="preserve">A third rebuild from teardown, on commit d4d062b, checked the newest version pins and the recovery path after a failed step. It stayed fail-closed throughout: the signed approval was published, but no remediation ran. Problems found in this run were fixed in commit fc6e75e.</w:t>
+      </w:r>
+    </w:p>
+    <w:p>
+      <w:pPr>
+        <w:spacing w:before="240" w:after="160"/>
+      </w:pPr>
+      <w:r>
+        <w:rPr>
+          <w:rFonts w:ascii="Calibri" w:hAnsi="Calibri" w:eastAsia="Calibri"/>
+          <w:b/>
+          <w:color w:val="1B365D"/>
+          <w:sz w:val="24"/>
+        </w:rPr>
+        <w:t xml:space="preserve">Results</w:t>
+      </w:r>
+    </w:p>
+    <w:tbl>
+      <w:tblPr>
+        <w:tblW w:type="auto" w:w="0"/>
+        <w:tblLook w:firstColumn="1" w:firstRow="1" w:lastColumn="0" w:lastRow="0" w:noHBand="0" w:noVBand="1" w:val="04A0"/>
+      </w:tblPr>
+      <w:tblGrid>
+        <w:gridCol w:w="4896"/>
+        <w:gridCol w:w="4896"/>
+      </w:tblGrid>
+      <w:tr>
+        <w:tc>
+          <w:tcPr>
+            <w:tcW w:type="dxa" w:w="4896"/>
+            <w:tcBorders>
+              <w:top w:val="single" w:sz="4" w:space="0" w:color="D0D7DE"/>
+              <w:left w:val="single" w:sz="4" w:space="0" w:color="D0D7DE"/>
+              <w:bottom w:val="single" w:sz="4" w:space="0" w:color="D0D7DE"/>
+              <w:right w:val="single" w:sz="4" w:space="0" w:color="D0D7DE"/>
+            </w:tcBorders>
+            <w:shd w:fill="1B365D" w:val="clear"/>
+          </w:tcPr>
+          <w:p>
+            <w:r/>
+            <w:r>
+              <w:rPr>
+                <w:rFonts w:ascii="Calibri" w:hAnsi="Calibri" w:eastAsia="Calibri"/>
+                <w:b/>
+                <w:color w:val="FFFFFF"/>
+                <w:sz w:val="18"/>
+              </w:rPr>
+              <w:t>Step</w:t>
+            </w:r>
+          </w:p>
+        </w:tc>
+        <w:tc>
+          <w:tcPr>
+            <w:tcW w:type="dxa" w:w="4896"/>
+            <w:tcBorders>
+              <w:top w:val="single" w:sz="4" w:space="0" w:color="D0D7DE"/>
+              <w:left w:val="single" w:sz="4" w:space="0" w:color="D0D7DE"/>
+              <w:bottom w:val="single" w:sz="4" w:space="0" w:color="D0D7DE"/>
+              <w:right w:val="single" w:sz="4" w:space="0" w:color="D0D7DE"/>
+            </w:tcBorders>
+            <w:shd w:fill="1B365D" w:val="clear"/>
+          </w:tcPr>
+          <w:p>
+            <w:r/>
+            <w:r>
+              <w:rPr>
+                <w:rFonts w:ascii="Calibri" w:hAnsi="Calibri" w:eastAsia="Calibri"/>
+                <w:b/>
+                <w:color w:val="FFFFFF"/>
+                <w:sz w:val="18"/>
+              </w:rPr>
+              <w:t>Result</w:t>
+            </w:r>
+          </w:p>
+        </w:tc>
+      </w:tr>
+      <w:tr>
+        <w:tc>
+          <w:tcPr>
+            <w:tcW w:type="dxa" w:w="4896"/>
+            <w:tcBorders>
+              <w:top w:val="single" w:sz="4" w:space="0" w:color="D0D7DE"/>
+              <w:left w:val="single" w:sz="4" w:space="0" w:color="D0D7DE"/>
+              <w:bottom w:val="single" w:sz="4" w:space="0" w:color="D0D7DE"/>
+              <w:right w:val="single" w:sz="4" w:space="0" w:color="D0D7DE"/>
+            </w:tcBorders>
+          </w:tcPr>
+          <w:p>
+            <w:r/>
+            <w:r>
+              <w:rPr>
+                <w:rFonts w:ascii="Calibri" w:hAnsi="Calibri" w:eastAsia="Calibri"/>
+                <w:b w:val="0"/>
+                <w:sz w:val="18"/>
+              </w:rPr>
+              <w:t>01-validate.sh</w:t>
+            </w:r>
+          </w:p>
+        </w:tc>
+        <w:tc>
+          <w:tcPr>
+            <w:tcW w:type="dxa" w:w="4896"/>
+            <w:tcBorders>
+              <w:top w:val="single" w:sz="4" w:space="0" w:color="D0D7DE"/>
+              <w:left w:val="single" w:sz="4" w:space="0" w:color="D0D7DE"/>
+              <w:bottom w:val="single" w:sz="4" w:space="0" w:color="D0D7DE"/>
+              <w:right w:val="single" w:sz="4" w:space="0" w:color="D0D7DE"/>
+            </w:tcBorders>
+          </w:tcPr>
+          <w:p>
+            <w:r/>
+            <w:r>
+              <w:rPr>
+                <w:rFonts w:ascii="Calibri" w:hAnsi="Calibri" w:eastAsia="Calibri"/>
+                <w:b w:val="0"/>
+                <w:sz w:val="18"/>
+              </w:rPr>
+              <w:t>Passed: 11 Python tests, 5 OPA tests, 357 Conftest checks</w:t>
+            </w:r>
+          </w:p>
+        </w:tc>
+      </w:tr>
+      <w:tr>
+        <w:tc>
+          <w:tcPr>
+            <w:tcW w:type="dxa" w:w="4896"/>
+            <w:tcBorders>
+              <w:top w:val="single" w:sz="4" w:space="0" w:color="D0D7DE"/>
+              <w:left w:val="single" w:sz="4" w:space="0" w:color="D0D7DE"/>
+              <w:bottom w:val="single" w:sz="4" w:space="0" w:color="D0D7DE"/>
+              <w:right w:val="single" w:sz="4" w:space="0" w:color="D0D7DE"/>
+            </w:tcBorders>
+            <w:shd w:fill="F4F7FA" w:val="clear"/>
+          </w:tcPr>
+          <w:p>
+            <w:r/>
+            <w:r>
+              <w:rPr>
+                <w:rFonts w:ascii="Calibri" w:hAnsi="Calibri" w:eastAsia="Calibri"/>
+                <w:b w:val="0"/>
+                <w:sz w:val="18"/>
+              </w:rPr>
+              <w:t>03-adopt-retained-gcp.sh</w:t>
+            </w:r>
+          </w:p>
+        </w:tc>
+        <w:tc>
+          <w:tcPr>
+            <w:tcW w:type="dxa" w:w="4896"/>
+            <w:tcBorders>
+              <w:top w:val="single" w:sz="4" w:space="0" w:color="D0D7DE"/>
+              <w:left w:val="single" w:sz="4" w:space="0" w:color="D0D7DE"/>
+              <w:bottom w:val="single" w:sz="4" w:space="0" w:color="D0D7DE"/>
+              <w:right w:val="single" w:sz="4" w:space="0" w:color="D0D7DE"/>
+            </w:tcBorders>
+            <w:shd w:fill="F4F7FA" w:val="clear"/>
+          </w:tcPr>
+          <w:p>
+            <w:r/>
+            <w:r>
+              <w:rPr>
+                <w:rFonts w:ascii="Calibri" w:hAnsi="Calibri" w:eastAsia="Calibri"/>
+                <w:b w:val="0"/>
+                <w:sz w:val="18"/>
+              </w:rPr>
+              <w:t>First run blocked by a parallel apply's state lock; rerun imported all</w:t>
+            </w:r>
+          </w:p>
+        </w:tc>
+      </w:tr>
+      <w:tr>
+        <w:tc>
+          <w:tcPr>
+            <w:tcW w:type="dxa" w:w="4896"/>
+            <w:tcBorders>
+              <w:top w:val="single" w:sz="4" w:space="0" w:color="D0D7DE"/>
+              <w:left w:val="single" w:sz="4" w:space="0" w:color="D0D7DE"/>
+              <w:bottom w:val="single" w:sz="4" w:space="0" w:color="D0D7DE"/>
+              <w:right w:val="single" w:sz="4" w:space="0" w:color="D0D7DE"/>
+            </w:tcBorders>
+          </w:tcPr>
+          <w:p>
+            <w:r/>
+            <w:r>
+              <w:rPr>
+                <w:rFonts w:ascii="Calibri" w:hAnsi="Calibri" w:eastAsia="Calibri"/>
+                <w:b w:val="0"/>
+                <w:sz w:val="18"/>
+              </w:rPr>
+              <w:t>terraform apply</w:t>
+            </w:r>
+          </w:p>
+        </w:tc>
+        <w:tc>
+          <w:tcPr>
+            <w:tcW w:type="dxa" w:w="4896"/>
+            <w:tcBorders>
+              <w:top w:val="single" w:sz="4" w:space="0" w:color="D0D7DE"/>
+              <w:left w:val="single" w:sz="4" w:space="0" w:color="D0D7DE"/>
+              <w:bottom w:val="single" w:sz="4" w:space="0" w:color="D0D7DE"/>
+              <w:right w:val="single" w:sz="4" w:space="0" w:color="D0D7DE"/>
+            </w:tcBorders>
+          </w:tcPr>
+          <w:p>
+            <w:r/>
+            <w:r>
+              <w:rPr>
+                <w:rFonts w:ascii="Calibri" w:hAnsi="Calibri" w:eastAsia="Calibri"/>
+                <w:b w:val="0"/>
+                <w:sz w:val="18"/>
+              </w:rPr>
+              <w:t>Finished in a second pass after 03; no cluster replacement</w:t>
+            </w:r>
+          </w:p>
+        </w:tc>
+      </w:tr>
+      <w:tr>
+        <w:tc>
+          <w:tcPr>
+            <w:tcW w:type="dxa" w:w="4896"/>
+            <w:tcBorders>
+              <w:top w:val="single" w:sz="4" w:space="0" w:color="D0D7DE"/>
+              <w:left w:val="single" w:sz="4" w:space="0" w:color="D0D7DE"/>
+              <w:bottom w:val="single" w:sz="4" w:space="0" w:color="D0D7DE"/>
+              <w:right w:val="single" w:sz="4" w:space="0" w:color="D0D7DE"/>
+            </w:tcBorders>
+            <w:shd w:fill="F4F7FA" w:val="clear"/>
+          </w:tcPr>
+          <w:p>
+            <w:r/>
+            <w:r>
+              <w:rPr>
+                <w:rFonts w:ascii="Calibri" w:hAnsi="Calibri" w:eastAsia="Calibri"/>
+                <w:b w:val="0"/>
+                <w:sz w:val="18"/>
+              </w:rPr>
+              <w:t>Governed Release 39000392806</w:t>
+            </w:r>
+          </w:p>
+        </w:tc>
+        <w:tc>
+          <w:tcPr>
+            <w:tcW w:type="dxa" w:w="4896"/>
+            <w:tcBorders>
+              <w:top w:val="single" w:sz="4" w:space="0" w:color="D0D7DE"/>
+              <w:left w:val="single" w:sz="4" w:space="0" w:color="D0D7DE"/>
+              <w:bottom w:val="single" w:sz="4" w:space="0" w:color="D0D7DE"/>
+              <w:right w:val="single" w:sz="4" w:space="0" w:color="D0D7DE"/>
+            </w:tcBorders>
+            <w:shd w:fill="F4F7FA" w:val="clear"/>
+          </w:tcPr>
+          <w:p>
+            <w:r/>
+            <w:r>
+              <w:rPr>
+                <w:rFonts w:ascii="Calibri" w:hAnsi="Calibri" w:eastAsia="Calibri"/>
+                <w:b w:val="0"/>
+                <w:sz w:val="18"/>
+              </w:rPr>
+              <w:t>Release job passed on ubuntu-24.04 runners; deploy job skipped</w:t>
+            </w:r>
+          </w:p>
+        </w:tc>
+      </w:tr>
+      <w:tr>
+        <w:tc>
+          <w:tcPr>
+            <w:tcW w:type="dxa" w:w="4896"/>
+            <w:tcBorders>
+              <w:top w:val="single" w:sz="4" w:space="0" w:color="D0D7DE"/>
+              <w:left w:val="single" w:sz="4" w:space="0" w:color="D0D7DE"/>
+              <w:bottom w:val="single" w:sz="4" w:space="0" w:color="D0D7DE"/>
+              <w:right w:val="single" w:sz="4" w:space="0" w:color="D0D7DE"/>
+            </w:tcBorders>
+          </w:tcPr>
+          <w:p>
+            <w:r/>
+            <w:r>
+              <w:rPr>
+                <w:rFonts w:ascii="Calibri" w:hAnsi="Calibri" w:eastAsia="Calibri"/>
+                <w:b w:val="0"/>
+                <w:sz w:val="18"/>
+              </w:rPr>
+              <w:t>04 / 05 / 08</w:t>
+            </w:r>
+          </w:p>
+        </w:tc>
+        <w:tc>
+          <w:tcPr>
+            <w:tcW w:type="dxa" w:w="4896"/>
+            <w:tcBorders>
+              <w:top w:val="single" w:sz="4" w:space="0" w:color="D0D7DE"/>
+              <w:left w:val="single" w:sz="4" w:space="0" w:color="D0D7DE"/>
+              <w:bottom w:val="single" w:sz="4" w:space="0" w:color="D0D7DE"/>
+              <w:right w:val="single" w:sz="4" w:space="0" w:color="D0D7DE"/>
+            </w:tcBorders>
+          </w:tcPr>
+          <w:p>
+            <w:r/>
+            <w:r>
+              <w:rPr>
+                <w:rFonts w:ascii="Calibri" w:hAnsi="Calibri" w:eastAsia="Calibri"/>
+                <w:b w:val="0"/>
+                <w:sz w:val="18"/>
+              </w:rPr>
+              <w:t>11 images pushed (one retry after a registry timeout); all Deployments ready</w:t>
+            </w:r>
+          </w:p>
+        </w:tc>
+      </w:tr>
+      <w:tr>
+        <w:tc>
+          <w:tcPr>
+            <w:tcW w:type="dxa" w:w="4896"/>
+            <w:tcBorders>
+              <w:top w:val="single" w:sz="4" w:space="0" w:color="D0D7DE"/>
+              <w:left w:val="single" w:sz="4" w:space="0" w:color="D0D7DE"/>
+              <w:bottom w:val="single" w:sz="4" w:space="0" w:color="D0D7DE"/>
+              <w:right w:val="single" w:sz="4" w:space="0" w:color="D0D7DE"/>
+            </w:tcBorders>
+            <w:shd w:fill="F4F7FA" w:val="clear"/>
+          </w:tcPr>
+          <w:p>
+            <w:r/>
+            <w:r>
+              <w:rPr>
+                <w:rFonts w:ascii="Calibri" w:hAnsi="Calibri" w:eastAsia="Calibri"/>
+                <w:b w:val="0"/>
+                <w:sz w:val="18"/>
+              </w:rPr>
+              <w:t>09-test-governance.sh</w:t>
+            </w:r>
+          </w:p>
+        </w:tc>
+        <w:tc>
+          <w:tcPr>
+            <w:tcW w:type="dxa" w:w="4896"/>
+            <w:tcBorders>
+              <w:top w:val="single" w:sz="4" w:space="0" w:color="D0D7DE"/>
+              <w:left w:val="single" w:sz="4" w:space="0" w:color="D0D7DE"/>
+              <w:bottom w:val="single" w:sz="4" w:space="0" w:color="D0D7DE"/>
+              <w:right w:val="single" w:sz="4" w:space="0" w:color="D0D7DE"/>
+            </w:tcBorders>
+            <w:shd w:fill="F4F7FA" w:val="clear"/>
+          </w:tcPr>
+          <w:p>
+            <w:r/>
+            <w:r>
+              <w:rPr>
+                <w:rFonts w:ascii="Calibri" w:hAnsi="Calibri" w:eastAsia="Calibri"/>
+                <w:b w:val="0"/>
+                <w:sz w:val="18"/>
+              </w:rPr>
+              <w:t>REQUIRE_APPROVAL from OPA (automation mode is not controlled)</w:t>
+            </w:r>
+          </w:p>
+        </w:tc>
+      </w:tr>
+      <w:tr>
+        <w:tc>
+          <w:tcPr>
+            <w:tcW w:type="dxa" w:w="4896"/>
+            <w:tcBorders>
+              <w:top w:val="single" w:sz="4" w:space="0" w:color="D0D7DE"/>
+              <w:left w:val="single" w:sz="4" w:space="0" w:color="D0D7DE"/>
+              <w:bottom w:val="single" w:sz="4" w:space="0" w:color="D0D7DE"/>
+              <w:right w:val="single" w:sz="4" w:space="0" w:color="D0D7DE"/>
+            </w:tcBorders>
+          </w:tcPr>
+          <w:p>
+            <w:r/>
+            <w:r>
+              <w:rPr>
+                <w:rFonts w:ascii="Calibri" w:hAnsi="Calibri" w:eastAsia="Calibri"/>
+                <w:b w:val="0"/>
+                <w:sz w:val="18"/>
+              </w:rPr>
+              <w:t>11-review-approval.sh</w:t>
+            </w:r>
+          </w:p>
+        </w:tc>
+        <w:tc>
+          <w:tcPr>
+            <w:tcW w:type="dxa" w:w="4896"/>
+            <w:tcBorders>
+              <w:top w:val="single" w:sz="4" w:space="0" w:color="D0D7DE"/>
+              <w:left w:val="single" w:sz="4" w:space="0" w:color="D0D7DE"/>
+              <w:bottom w:val="single" w:sz="4" w:space="0" w:color="D0D7DE"/>
+              <w:right w:val="single" w:sz="4" w:space="0" w:color="D0D7DE"/>
+            </w:tcBorders>
+          </w:tcPr>
+          <w:p>
+            <w:r/>
+            <w:r>
+              <w:rPr>
+                <w:rFonts w:ascii="Calibri" w:hAnsi="Calibri" w:eastAsia="Calibri"/>
+                <w:b w:val="0"/>
+                <w:sz w:val="18"/>
+              </w:rPr>
+              <w:t>KMS v12 approval signed and published; a second request left pending</w:t>
+            </w:r>
+          </w:p>
+        </w:tc>
+      </w:tr>
+      <w:tr>
+        <w:tc>
+          <w:tcPr>
+            <w:tcW w:type="dxa" w:w="4896"/>
+            <w:tcBorders>
+              <w:top w:val="single" w:sz="4" w:space="0" w:color="D0D7DE"/>
+              <w:left w:val="single" w:sz="4" w:space="0" w:color="D0D7DE"/>
+              <w:bottom w:val="single" w:sz="4" w:space="0" w:color="D0D7DE"/>
+              <w:right w:val="single" w:sz="4" w:space="0" w:color="D0D7DE"/>
+            </w:tcBorders>
+            <w:shd w:fill="F4F7FA" w:val="clear"/>
+          </w:tcPr>
+          <w:p>
+            <w:r/>
+            <w:r>
+              <w:rPr>
+                <w:rFonts w:ascii="Calibri" w:hAnsi="Calibri" w:eastAsia="Calibri"/>
+                <w:b w:val="0"/>
+                <w:sz w:val="18"/>
+              </w:rPr>
+              <w:t>10-test-pipeline.sh</w:t>
+            </w:r>
+          </w:p>
+        </w:tc>
+        <w:tc>
+          <w:tcPr>
+            <w:tcW w:type="dxa" w:w="4896"/>
+            <w:tcBorders>
+              <w:top w:val="single" w:sz="4" w:space="0" w:color="D0D7DE"/>
+              <w:left w:val="single" w:sz="4" w:space="0" w:color="D0D7DE"/>
+              <w:bottom w:val="single" w:sz="4" w:space="0" w:color="D0D7DE"/>
+              <w:right w:val="single" w:sz="4" w:space="0" w:color="D0D7DE"/>
+            </w:tcBorders>
+            <w:shd w:fill="F4F7FA" w:val="clear"/>
+          </w:tcPr>
+          <w:p>
+            <w:r/>
+            <w:r>
+              <w:rPr>
+                <w:rFonts w:ascii="Calibri" w:hAnsi="Calibri" w:eastAsia="Calibri"/>
+                <w:b w:val="0"/>
+                <w:sz w:val="18"/>
+              </w:rPr>
+              <w:t>Gemini rated the synthetic CRITICAL incident LOW; NO_ACTION report</w:t>
+            </w:r>
+          </w:p>
+        </w:tc>
+      </w:tr>
+      <w:tr>
+        <w:tc>
+          <w:tcPr>
+            <w:tcW w:type="dxa" w:w="4896"/>
+            <w:tcBorders>
+              <w:top w:val="single" w:sz="4" w:space="0" w:color="D0D7DE"/>
+              <w:left w:val="single" w:sz="4" w:space="0" w:color="D0D7DE"/>
+              <w:bottom w:val="single" w:sz="4" w:space="0" w:color="D0D7DE"/>
+              <w:right w:val="single" w:sz="4" w:space="0" w:color="D0D7DE"/>
+            </w:tcBorders>
+          </w:tcPr>
+          <w:p>
+            <w:r/>
+            <w:r>
+              <w:rPr>
+                <w:rFonts w:ascii="Calibri" w:hAnsi="Calibri" w:eastAsia="Calibri"/>
+                <w:b w:val="0"/>
+                <w:sz w:val="18"/>
+              </w:rPr>
+              <w:t>12-smoke-test-metrics.sh</w:t>
+            </w:r>
+          </w:p>
+        </w:tc>
+        <w:tc>
+          <w:tcPr>
+            <w:tcW w:type="dxa" w:w="4896"/>
+            <w:tcBorders>
+              <w:top w:val="single" w:sz="4" w:space="0" w:color="D0D7DE"/>
+              <w:left w:val="single" w:sz="4" w:space="0" w:color="D0D7DE"/>
+              <w:bottom w:val="single" w:sz="4" w:space="0" w:color="D0D7DE"/>
+              <w:right w:val="single" w:sz="4" w:space="0" w:color="D0D7DE"/>
+            </w:tcBorders>
+          </w:tcPr>
+          <w:p>
+            <w:r/>
+            <w:r>
+              <w:rPr>
+                <w:rFonts w:ascii="Calibri" w:hAnsi="Calibri" w:eastAsia="Calibri"/>
+                <w:b w:val="0"/>
+                <w:sz w:val="18"/>
+              </w:rPr>
+              <w:t>Health endpoint and agent metrics exported (302 messages)</w:t>
+            </w:r>
+          </w:p>
+        </w:tc>
+      </w:tr>
+      <w:tr>
+        <w:tc>
+          <w:tcPr>
+            <w:tcW w:type="dxa" w:w="4896"/>
+            <w:tcBorders>
+              <w:top w:val="single" w:sz="4" w:space="0" w:color="D0D7DE"/>
+              <w:left w:val="single" w:sz="4" w:space="0" w:color="D0D7DE"/>
+              <w:bottom w:val="single" w:sz="4" w:space="0" w:color="D0D7DE"/>
+              <w:right w:val="single" w:sz="4" w:space="0" w:color="D0D7DE"/>
+            </w:tcBorders>
+            <w:shd w:fill="F4F7FA" w:val="clear"/>
+          </w:tcPr>
+          <w:p>
+            <w:r/>
+            <w:r>
+              <w:rPr>
+                <w:rFonts w:ascii="Calibri" w:hAnsi="Calibri" w:eastAsia="Calibri"/>
+                <w:b w:val="0"/>
+                <w:sz w:val="18"/>
+              </w:rPr>
+              <w:t>Trivy 0.76.0 job</w:t>
+            </w:r>
+          </w:p>
+        </w:tc>
+        <w:tc>
+          <w:tcPr>
+            <w:tcW w:type="dxa" w:w="4896"/>
+            <w:tcBorders>
+              <w:top w:val="single" w:sz="4" w:space="0" w:color="D0D7DE"/>
+              <w:left w:val="single" w:sz="4" w:space="0" w:color="D0D7DE"/>
+              <w:bottom w:val="single" w:sz="4" w:space="0" w:color="D0D7DE"/>
+              <w:right w:val="single" w:sz="4" w:space="0" w:color="D0D7DE"/>
+            </w:tcBorders>
+            <w:shd w:fill="F4F7FA" w:val="clear"/>
+          </w:tcPr>
+          <w:p>
+            <w:r/>
+            <w:r>
+              <w:rPr>
+                <w:rFonts w:ascii="Calibri" w:hAnsi="Calibri" w:eastAsia="Calibri"/>
+                <w:b w:val="0"/>
+                <w:sz w:val="18"/>
+              </w:rPr>
+              <w:t>First run of the new in-cluster version: 4 images scanned, findings accepted</w:t>
+            </w:r>
+          </w:p>
+        </w:tc>
+      </w:tr>
+      <w:tr>
+        <w:tc>
+          <w:tcPr>
+            <w:tcW w:type="dxa" w:w="4896"/>
+            <w:tcBorders>
+              <w:top w:val="single" w:sz="4" w:space="0" w:color="D0D7DE"/>
+              <w:left w:val="single" w:sz="4" w:space="0" w:color="D0D7DE"/>
+              <w:bottom w:val="single" w:sz="4" w:space="0" w:color="D0D7DE"/>
+              <w:right w:val="single" w:sz="4" w:space="0" w:color="D0D7DE"/>
+            </w:tcBorders>
+          </w:tcPr>
+          <w:p>
+            <w:r/>
+            <w:r>
+              <w:rPr>
+                <w:rFonts w:ascii="Calibri" w:hAnsi="Calibri" w:eastAsia="Calibri"/>
+                <w:b w:val="0"/>
+                <w:sz w:val="18"/>
+              </w:rPr>
+              <w:t>Prowler 5.35.0 job</w:t>
+            </w:r>
+          </w:p>
+        </w:tc>
+        <w:tc>
+          <w:tcPr>
+            <w:tcW w:type="dxa" w:w="4896"/>
+            <w:tcBorders>
+              <w:top w:val="single" w:sz="4" w:space="0" w:color="D0D7DE"/>
+              <w:left w:val="single" w:sz="4" w:space="0" w:color="D0D7DE"/>
+              <w:bottom w:val="single" w:sz="4" w:space="0" w:color="D0D7DE"/>
+              <w:right w:val="single" w:sz="4" w:space="0" w:color="D0D7DE"/>
+            </w:tcBorders>
+          </w:tcPr>
+          <w:p>
+            <w:r/>
+            <w:r>
+              <w:rPr>
+                <w:rFonts w:ascii="Calibri" w:hAnsi="Calibri" w:eastAsia="Calibri"/>
+                <w:b w:val="0"/>
+                <w:sz w:val="18"/>
+              </w:rPr>
+              <w:t>109 checks: 138 fail, 170 pass, 175 muted; findings accepted</w:t>
+            </w:r>
+          </w:p>
+        </w:tc>
+      </w:tr>
+      <w:tr>
+        <w:tc>
+          <w:tcPr>
+            <w:tcW w:type="dxa" w:w="4896"/>
+            <w:tcBorders>
+              <w:top w:val="single" w:sz="4" w:space="0" w:color="D0D7DE"/>
+              <w:left w:val="single" w:sz="4" w:space="0" w:color="D0D7DE"/>
+              <w:bottom w:val="single" w:sz="4" w:space="0" w:color="D0D7DE"/>
+              <w:right w:val="single" w:sz="4" w:space="0" w:color="D0D7DE"/>
+            </w:tcBorders>
+            <w:shd w:fill="F4F7FA" w:val="clear"/>
+          </w:tcPr>
+          <w:p>
+            <w:r/>
+            <w:r>
+              <w:rPr>
+                <w:rFonts w:ascii="Calibri" w:hAnsi="Calibri" w:eastAsia="Calibri"/>
+                <w:b w:val="0"/>
+                <w:sz w:val="18"/>
+              </w:rPr>
+              <w:t>15-teardown.sh</w:t>
+            </w:r>
+          </w:p>
+        </w:tc>
+        <w:tc>
+          <w:tcPr>
+            <w:tcW w:type="dxa" w:w="4896"/>
+            <w:tcBorders>
+              <w:top w:val="single" w:sz="4" w:space="0" w:color="D0D7DE"/>
+              <w:left w:val="single" w:sz="4" w:space="0" w:color="D0D7DE"/>
+              <w:bottom w:val="single" w:sz="4" w:space="0" w:color="D0D7DE"/>
+              <w:right w:val="single" w:sz="4" w:space="0" w:color="D0D7DE"/>
+            </w:tcBorders>
+            <w:shd w:fill="F4F7FA" w:val="clear"/>
+          </w:tcPr>
+          <w:p>
+            <w:r/>
+            <w:r>
+              <w:rPr>
+                <w:rFonts w:ascii="Calibri" w:hAnsi="Calibri" w:eastAsia="Calibri"/>
+                <w:b w:val="0"/>
+                <w:sz w:val="18"/>
+              </w:rPr>
+              <w:t>188 resources destroyed in 13 minutes; KMS key ring and version 12 retained</w:t>
+            </w:r>
+          </w:p>
+        </w:tc>
+      </w:tr>
+      <w:tr>
+        <w:tc>
+          <w:tcPr>
+            <w:tcW w:type="dxa" w:w="4896"/>
+            <w:tcBorders>
+              <w:top w:val="single" w:sz="4" w:space="0" w:color="D0D7DE"/>
+              <w:left w:val="single" w:sz="4" w:space="0" w:color="D0D7DE"/>
+              <w:bottom w:val="single" w:sz="4" w:space="0" w:color="D0D7DE"/>
+              <w:right w:val="single" w:sz="4" w:space="0" w:color="D0D7DE"/>
+            </w:tcBorders>
+          </w:tcPr>
+          <w:p>
+            <w:r/>
+            <w:r>
+              <w:rPr>
+                <w:rFonts w:ascii="Calibri" w:hAnsi="Calibri" w:eastAsia="Calibri"/>
+                <w:b w:val="0"/>
+                <w:sz w:val="18"/>
+              </w:rPr>
+              <w:t>Not exercised</w:t>
+            </w:r>
+          </w:p>
+        </w:tc>
+        <w:tc>
+          <w:tcPr>
+            <w:tcW w:type="dxa" w:w="4896"/>
+            <w:tcBorders>
+              <w:top w:val="single" w:sz="4" w:space="0" w:color="D0D7DE"/>
+              <w:left w:val="single" w:sz="4" w:space="0" w:color="D0D7DE"/>
+              <w:bottom w:val="single" w:sz="4" w:space="0" w:color="D0D7DE"/>
+              <w:right w:val="single" w:sz="4" w:space="0" w:color="D0D7DE"/>
+            </w:tcBorders>
+          </w:tcPr>
+          <w:p>
+            <w:r/>
+            <w:r>
+              <w:rPr>
+                <w:rFonts w:ascii="Calibri" w:hAnsi="Calibri" w:eastAsia="Calibri"/>
+                <w:b w:val="0"/>
+                <w:sz w:val="18"/>
+              </w:rPr>
+              <w:t>Controlled remediation, signed-digest deploy (14), Slack, BigQuery query</w:t>
+            </w:r>
+          </w:p>
+        </w:tc>
+      </w:tr>
+    </w:tbl>
+    <w:p>
+      <w:pPr>
+        <w:spacing w:before="200" w:after="160" w:line="240" w:lineRule="auto"/>
+      </w:pPr>
+      <w:r>
+        <w:rPr>
+          <w:rFonts w:ascii="Calibri" w:hAnsi="Calibri" w:eastAsia="Calibri"/>
+          <w:b w:val="0"/>
+          <w:sz w:val="22"/>
+        </w:rPr>
+        <w:t xml:space="preserve">Fixes from this run: 03 now stops if any import fails, the guides no longer say 11 signs the oldest request, and troubleshooting covers the state lock, the registry timeout, and an empty BigQuery table name. CI and release runners are pinned to ubuntu-24.04 ahead of the move of ubuntu-latest to 26.04.</w:t>
+      </w:r>
+    </w:p>
     <w:sectPr>
       <w:headerReference w:type="default" r:id="rId9"/>
       <w:footerReference w:type="default" r:id="rId10"/>
@@ -18585,7 +19318,7 @@
         <w:color w:val="5B6B7A"/>
         <w:sz w:val="18"/>
       </w:rPr>
-      <w:t>Agentic Security Platform | Plan Mode Summary | 16 October 2026</w:t>
+      <w:t>Agentic Security Platform | Plan Mode Summary | 17 October 2026</w:t>
     </w:r>
   </w:p>
 </w:hdr>

</xml_diff>